<commit_message>
need to work on existing CV english
</commit_message>
<xml_diff>
--- a/cover-letter-flk.docx
+++ b/cover-letter-flk.docx
@@ -43,26 +43,7 @@
           <w:u w:val="none"/>
           <w:lang w:val="en-US" w:eastAsia="zxx" w:bidi="zxx"/>
         </w:rPr>
-        <w:t>Recruiting Team</w:t>
-      </w:r>
-      <w:r>
-        <w:rPr>
-          <w:rStyle w:val="InternetLink"/>
-          <w:rFonts w:eastAsia="Tahoma" w:cs="Arial" w:ascii="Poppins" w:hAnsi="Poppins"/>
-          <w:b w:val="false"/>
-          <w:bCs w:val="false"/>
-          <w:i w:val="false"/>
-          <w:caps w:val="false"/>
-          <w:smallCaps w:val="false"/>
-          <w:color w:val="333333"/>
-          <w:spacing w:val="0"/>
-          <w:kern w:val="0"/>
-          <w:sz w:val="22"/>
-          <w:szCs w:val="22"/>
-          <w:u w:val="none"/>
-          <w:lang w:val="en-US" w:eastAsia="zxx" w:bidi="zxx"/>
-        </w:rPr>
-        <w:t>,</w:t>
+        <w:t>Recruiting Team,</w:t>
       </w:r>
     </w:p>
     <w:p>
@@ -189,45 +170,7 @@
           <w:u w:val="none"/>
           <w:lang w:val="en-US"/>
         </w:rPr>
-        <w:t xml:space="preserve"> thrilled to find that my 13 years of experience as a successful Senior Software/</w:t>
-      </w:r>
-      <w:r>
-        <w:rPr>
-          <w:rStyle w:val="InternetLink"/>
-          <w:rFonts w:cs="Arial" w:ascii="Poppins" w:hAnsi="Poppins"/>
-          <w:b w:val="false"/>
-          <w:bCs w:val="false"/>
-          <w:i w:val="false"/>
-          <w:caps w:val="false"/>
-          <w:smallCaps w:val="false"/>
-          <w:color w:val="333333"/>
-          <w:spacing w:val="0"/>
-          <w:kern w:val="0"/>
-          <w:sz w:val="22"/>
-          <w:szCs w:val="22"/>
-          <w:u w:val="none"/>
-          <w:lang w:val="en-US"/>
-        </w:rPr>
-        <w:t>Cloud</w:t>
-      </w:r>
-      <w:r>
-        <w:rPr>
-          <w:rStyle w:val="InternetLink"/>
-          <w:rFonts w:cs="Arial" w:ascii="Poppins" w:hAnsi="Poppins"/>
-          <w:b w:val="false"/>
-          <w:bCs w:val="false"/>
-          <w:i w:val="false"/>
-          <w:caps w:val="false"/>
-          <w:smallCaps w:val="false"/>
-          <w:color w:val="333333"/>
-          <w:spacing w:val="0"/>
-          <w:kern w:val="0"/>
-          <w:sz w:val="22"/>
-          <w:szCs w:val="22"/>
-          <w:u w:val="none"/>
-          <w:lang w:val="en-US"/>
-        </w:rPr>
-        <w:t xml:space="preserve"> Architect align perfectly with the skills and qualifications you are seeking.</w:t>
+        <w:t xml:space="preserve"> thrilled to find that my 13 years of experience as a successful Senior Software/Cloud Architect align perfectly with the skills and qualifications you are seeking.</w:t>
       </w:r>
     </w:p>
     <w:p>
@@ -501,50 +444,67 @@
         <w:pStyle w:val="TextBody"/>
         <w:rPr/>
       </w:pPr>
-      <w:r>
-        <w:rPr>
-          <w:rStyle w:val="InternetLink"/>
-          <w:rFonts w:cs="Arial" w:ascii="Poppins" w:hAnsi="Poppins"/>
-          <w:b w:val="false"/>
-          <w:bCs w:val="false"/>
-          <w:i w:val="false"/>
-          <w:caps w:val="false"/>
-          <w:smallCaps w:val="false"/>
-          <w:color w:val="333333"/>
-          <w:spacing w:val="0"/>
-          <w:kern w:val="0"/>
-          <w:sz w:val="22"/>
-          <w:szCs w:val="22"/>
-          <w:u w:val="none"/>
-          <w:lang w:val="en-US"/>
-        </w:rPr>
-        <w:t>https://www.linkedin.com/in/bharat-shah-3150b478/</w:t>
-      </w:r>
-    </w:p>
-    <w:p>
-      <w:pPr>
-        <w:pStyle w:val="TextBody"/>
-        <w:rPr/>
-      </w:pPr>
-      <w:r>
-        <w:rPr>
-          <w:rStyle w:val="InternetLink"/>
-          <w:rFonts w:cs="Arial" w:ascii="Poppins" w:hAnsi="Poppins"/>
-          <w:b w:val="false"/>
-          <w:bCs w:val="false"/>
-          <w:i w:val="false"/>
-          <w:caps w:val="false"/>
-          <w:smallCaps w:val="false"/>
-          <w:color w:val="333333"/>
-          <w:spacing w:val="0"/>
-          <w:kern w:val="0"/>
-          <w:sz w:val="22"/>
-          <w:szCs w:val="22"/>
-          <w:u w:val="none"/>
-          <w:lang w:val="en-US"/>
-        </w:rPr>
-        <w:t>https://github.com/b-limitless</w:t>
-      </w:r>
+      <w:hyperlink r:id="rId3">
+        <w:r>
+          <w:rPr>
+            <w:rStyle w:val="InternetLink"/>
+            <w:rFonts w:cs="Arial" w:ascii="Poppins" w:hAnsi="Poppins"/>
+            <w:b w:val="false"/>
+            <w:bCs w:val="false"/>
+            <w:i w:val="false"/>
+            <w:caps w:val="false"/>
+            <w:smallCaps w:val="false"/>
+            <w:color w:val="333333"/>
+            <w:spacing w:val="0"/>
+            <w:kern w:val="0"/>
+            <w:sz w:val="22"/>
+            <w:szCs w:val="22"/>
+            <w:u w:val="none"/>
+            <w:lang w:val="en-US"/>
+          </w:rPr>
+          <w:t>LinkedIn</w:t>
+        </w:r>
+      </w:hyperlink>
+      <w:r>
+        <w:rPr>
+          <w:rStyle w:val="InternetLink"/>
+          <w:rFonts w:cs="Arial" w:ascii="Poppins" w:hAnsi="Poppins"/>
+          <w:b w:val="false"/>
+          <w:bCs w:val="false"/>
+          <w:i w:val="false"/>
+          <w:caps w:val="false"/>
+          <w:smallCaps w:val="false"/>
+          <w:color w:val="333333"/>
+          <w:spacing w:val="0"/>
+          <w:kern w:val="0"/>
+          <w:sz w:val="22"/>
+          <w:szCs w:val="22"/>
+          <w:u w:val="none"/>
+          <w:lang w:val="nb-NO"/>
+        </w:rPr>
+        <w:t xml:space="preserve"> | </w:t>
+      </w:r>
+      <w:hyperlink r:id="rId4" w:tgtFrame="_new">
+        <w:r>
+          <w:rPr>
+            <w:rStyle w:val="InternetLink"/>
+            <w:rFonts w:cs="Arial" w:ascii="Poppins" w:hAnsi="Poppins"/>
+            <w:b w:val="false"/>
+            <w:bCs w:val="false"/>
+            <w:i w:val="false"/>
+            <w:caps w:val="false"/>
+            <w:smallCaps w:val="false"/>
+            <w:color w:val="333333"/>
+            <w:spacing w:val="0"/>
+            <w:kern w:val="0"/>
+            <w:sz w:val="22"/>
+            <w:szCs w:val="22"/>
+            <w:u w:val="none"/>
+            <w:lang w:val="en-US"/>
+          </w:rPr>
+          <w:t>GitHub</w:t>
+        </w:r>
+      </w:hyperlink>
     </w:p>
     <w:p>
       <w:pPr>
@@ -651,7 +611,7 @@
     <w:pPr>
       <w:widowControl/>
       <w:suppressAutoHyphens w:val="true"/>
-      <w:overflowPunct w:val="true"/>
+      <w:overflowPunct w:val="false"/>
       <w:bidi w:val="0"/>
       <w:spacing w:lineRule="auto" w:line="276" w:before="0" w:after="160"/>
       <w:jc w:val="left"/>
@@ -1290,7 +1250,7 @@
     <w:pPr>
       <w:widowControl/>
       <w:suppressAutoHyphens w:val="true"/>
-      <w:overflowPunct w:val="true"/>
+      <w:overflowPunct w:val="false"/>
       <w:bidi w:val="0"/>
       <w:spacing w:lineRule="auto" w:line="240" w:before="0" w:after="0"/>
       <w:jc w:val="left"/>

</xml_diff>